<commit_message>
fix(rd-jachymov): F2 dedup demontáž oken (remove aggregate) + F3 vyjasnění #33 (234→233)
F2 — remove HSV6.010 'Demontáž všech oken a dveří' (aggregate 25 ks) that double-counted
the detailed HSV6.013 (okna 16) + HSV6.014 (vstupní 2) + HSV6.015 (vnitřní 15) = 33 ks.
Aggregate also undercounted (25<33). No atomic entry, no cross-ref → clean delete.
Detail wins (ChatGPT correct). items 234→233.

F3 — pažení sklad VERIFY: statika D.2.1 §4.2 says 'jáma svahovaná, sklon 1:0,5' →
sklad cut solved by SVAHOVÁNÍ not pažení (HSV1.006 pažení do 2m is DŮM). No contradiction,
no blind change. Open point → vyjasnění #33: verify HSV1.002 výkop volume includes 1:0,5
battering in prudký svah + utility-trench pažení dle BOZP.

F1 (411321414 ×8) SKIPPED — legit code-sharing, not a bug.
10-step regen + assert docx 30==queue 30. snapshot items_pre_f2f3.json.

https://claude.ai/code/session_01FskzLAZkXgJAwuN2cQQEdx
</commit_message>
<xml_diff>
--- a/test-data/RD_Jachymov_dum/outputs/Otazky_pro_Karla_a_projektanty_2026-05-29.docx
+++ b/test-data/RD_Jachymov_dum/outputs/Otazky_pro_Karla_a_projektanty_2026-05-29.docx
@@ -160,7 +160,7 @@
     </w:p>
     <w:p>
       <w:r>
-        <w:t>Tento dokument obsahuje 29 otázek, které je třeba vyřešit s projektanty před cenovou kalkulací konkrétními řemesly a před zahájením realizace.</w:t>
+        <w:t>Tento dokument obsahuje 30 otázek, které je třeba vyřešit s projektanty před cenovou kalkulací konkrétními řemesly a před zahájením realizace.</w:t>
         <w:br/>
         <w:br/>
         <w:t>Každá otázka má uvedeno: kdo má odpovědět, co je třeba zjistit, jaký předpoklad jsme prozatím použili pro výpočet, a jak odpověď ovlivní rozpočet.</w:t>
@@ -2162,6 +2162,68 @@
                 <w:sz w:val="18"/>
               </w:rPr>
               <w:t>STŘEDNĚ DŮLEŽITÉ</w:t>
+            </w:r>
+          </w:p>
+        </w:tc>
+      </w:tr>
+      <w:tr>
+        <w:tc>
+          <w:tcPr>
+            <w:tcW w:type="dxa" w:w="2493"/>
+            <w:vAlign w:val="center"/>
+          </w:tcPr>
+          <w:p>
+            <w:pPr>
+              <w:jc w:val="center"/>
+            </w:pPr>
+            <w:r>
+              <w:rPr>
+                <w:sz w:val="18"/>
+              </w:rPr>
+              <w:t>33</w:t>
+            </w:r>
+          </w:p>
+        </w:tc>
+        <w:tc>
+          <w:tcPr>
+            <w:tcW w:type="dxa" w:w="2493"/>
+            <w:vAlign w:val="center"/>
+          </w:tcPr>
+          <w:p>
+            <w:r>
+              <w:rPr>
+                <w:sz w:val="18"/>
+              </w:rPr>
+              <w:t>Projektant (SMASH / TeAnau / TUSPO) nebo investor — viz akce</w:t>
+            </w:r>
+          </w:p>
+        </w:tc>
+        <w:tc>
+          <w:tcPr>
+            <w:tcW w:type="dxa" w:w="2493"/>
+            <w:vAlign w:val="center"/>
+          </w:tcPr>
+          <w:p>
+            <w:r>
+              <w:rPr>
+                <w:sz w:val="18"/>
+              </w:rPr>
+              <w:t>Sklad výkop — svahovaná jáma 1:0,5 v prudkém svahu (hloubka &gt;2 m)</w:t>
+            </w:r>
+          </w:p>
+        </w:tc>
+        <w:tc>
+          <w:tcPr>
+            <w:tcW w:type="dxa" w:w="2493"/>
+            <w:shd w:fill="C8E6C9"/>
+            <w:vAlign w:val="center"/>
+          </w:tcPr>
+          <w:p>
+            <w:r>
+              <w:rPr>
+                <w:sz w:val="18"/>
+              </w:rPr>
+              <w:t>MÉNĚ URGENTNÍ</w:t>
             </w:r>
           </w:p>
         </w:tc>
@@ -5984,6 +6046,132 @@
     </w:p>
     <w:p/>
     <w:p>
+      <w:pPr>
+        <w:pStyle w:val="Heading2"/>
+      </w:pPr>
+      <w:r>
+        <w:t>Otázka č. 33:  Sklad výkop — svahovaná jáma 1:0,5 v prudkém svahu (hloubka &gt;2 m)</w:t>
+      </w:r>
+    </w:p>
+    <w:tbl>
+      <w:tblPr>
+        <w:tblStyle w:val="LightList-Accent1"/>
+        <w:tblW w:type="auto" w:w="0"/>
+        <w:tblLook w:firstColumn="1" w:firstRow="1" w:lastColumn="0" w:lastRow="0" w:noHBand="0" w:noVBand="1" w:val="04A0"/>
+      </w:tblPr>
+      <w:tblGrid>
+        <w:gridCol w:w="4986"/>
+        <w:gridCol w:w="4986"/>
+      </w:tblGrid>
+      <w:tr>
+        <w:tc>
+          <w:tcPr>
+            <w:tcW w:type="dxa" w:w="4986"/>
+          </w:tcPr>
+          <w:p>
+            <w:r>
+              <w:rPr>
+                <w:b/>
+              </w:rPr>
+              <w:t>Komu</w:t>
+            </w:r>
+          </w:p>
+        </w:tc>
+        <w:tc>
+          <w:tcPr>
+            <w:tcW w:type="dxa" w:w="4986"/>
+          </w:tcPr>
+          <w:p>
+            <w:r>
+              <w:t>Projektant (SMASH / TeAnau / TUSPO) nebo investor — viz akce</w:t>
+            </w:r>
+          </w:p>
+        </w:tc>
+      </w:tr>
+      <w:tr>
+        <w:tc>
+          <w:tcPr>
+            <w:tcW w:type="dxa" w:w="4986"/>
+          </w:tcPr>
+          <w:p>
+            <w:r>
+              <w:rPr>
+                <w:b/>
+              </w:rPr>
+              <w:t>Důležitost</w:t>
+            </w:r>
+          </w:p>
+        </w:tc>
+        <w:tc>
+          <w:tcPr>
+            <w:tcW w:type="dxa" w:w="4986"/>
+            <w:shd w:fill="C8E6C9"/>
+          </w:tcPr>
+          <w:p>
+            <w:r>
+              <w:rPr>
+                <w:b/>
+              </w:rPr>
+              <w:t>MÉNĚ URGENTNÍ</w:t>
+            </w:r>
+          </w:p>
+        </w:tc>
+      </w:tr>
+    </w:tbl>
+    <w:p>
+      <w:r>
+        <w:rPr>
+          <w:b/>
+        </w:rPr>
+        <w:t>O co jde:</w:t>
+      </w:r>
+    </w:p>
+    <w:p>
+      <w:r>
+        <w:t>Sklad je zasazen do prudkého svahu. Statika D.2.1: 'Stavební jáma bude svahovaná, přípustný sklon dočasných výkopů 1:0,5 (F4)' — řešeno SVAHOVÁNÍM, ne pažením (HSV1.006 pažení do 2 m je DŮM). Sklad jámy jsou nezapažené (správně). Otevřené: zda objem hloubení 260217_sklad.HSV1.002 zahrnuje přídavek za svahování 1:0,5 a zda je v prudkém svahu dostupný dočasný zábor/prostor pro svah.</w:t>
+      </w:r>
+    </w:p>
+    <w:p>
+      <w:r>
+        <w:rPr>
+          <w:b/>
+        </w:rPr>
+        <w:t>Co je třeba:</w:t>
+      </w:r>
+    </w:p>
+    <w:p>
+      <w:r>
+        <w:t>Statiku/projektante: potvrďte, že objem výkopu skladu počítá se svahováním 1:0,5 + je dostupný prostor pro svah v prudkém svahu; pažení jen rýhy přípojek dle BOZP?</w:t>
+      </w:r>
+    </w:p>
+    <w:p>
+      <w:r>
+        <w:rPr>
+          <w:b/>
+        </w:rPr>
+        <w:t>Co prozatím máme (předpoklad pro výpočet):</w:t>
+      </w:r>
+    </w:p>
+    <w:p>
+      <w:r>
+        <w:t>Jáma svahovaná 1:0,5 (statika). Pažení sklad NEPŘIDÁNO. Rýhy přípojek pažit dle BOZP.</w:t>
+      </w:r>
+    </w:p>
+    <w:p>
+      <w:r>
+        <w:rPr>
+          <w:b/>
+        </w:rPr>
+        <w:t>Vliv na rozpočet:</w:t>
+      </w:r>
+    </w:p>
+    <w:p>
+      <w:r>
+        <w:t>Dotčené práce: 260217_sklad.HSV1.002 hloubení jam (objem vs svahování)</w:t>
+      </w:r>
+    </w:p>
+    <w:p/>
+    <w:p>
       <w:r>
         <w:br w:type="page"/>
       </w:r>

</xml_diff>

<commit_message>
fix(rd-jachymov): sokl reconcile — výkres S03 (Styrcon+keramický) wins, remove TZ duplicate (233→232)
PD rozpor resolved per investor decision (apply VÝKRES):
- TZ ARS dům text: sokl = XPS + cihelný obklad (HSV7.003)
- výkres S03 + Řez A-A + pohledy C: sokl = sanační Styrcon 200 + keramický obklad

Investor chose VÝKRES → removed HSV7.003 (XPS+cihelný) which double-counted the sokl
obklad (cihelný 13.5 + keramický 23 = 36.5 m² on ~23 m² sokl). Sokl now single S03
treatment (HSV7.007 Styrcon + HSV7.008 nopová folie + HSV7.009 keramický obklad).
Omítka HSV7.006 290.2→276.7 (sokl is keramický obklad, not omítka).

vyjasnění #35 — projektant confirm: výkres (Styrcon+keramický) vs TZ ARS (XPS+cihelný)
+ sokl area should apply řadovka 0.7 (23→~16 m²). HSV7.003 atomic block removed.
10-step regen + assert 31==queue 31. snapshot items_pre_sokl_reconcile.json.

https://claude.ai/code/session_01FskzLAZkXgJAwuN2cQQEdx
</commit_message>
<xml_diff>
--- a/test-data/RD_Jachymov_dum/outputs/Otazky_pro_Karla_a_projektanty_2026-05-29.docx
+++ b/test-data/RD_Jachymov_dum/outputs/Otazky_pro_Karla_a_projektanty_2026-05-29.docx
@@ -160,7 +160,7 @@
     </w:p>
     <w:p>
       <w:r>
-        <w:t>Tento dokument obsahuje 30 otázek, které je třeba vyřešit s projektanty před cenovou kalkulací konkrétními řemesly a před zahájením realizace.</w:t>
+        <w:t>Tento dokument obsahuje 31 otázek, které je třeba vyřešit s projektanty před cenovou kalkulací konkrétními řemesly a před zahájením realizace.</w:t>
         <w:br/>
         <w:br/>
         <w:t>Každá otázka má uvedeno: kdo má odpovědět, co je třeba zjistit, jaký předpoklad jsme prozatím použili pro výpočet, a jak odpověď ovlivní rozpočet.</w:t>
@@ -2224,6 +2224,68 @@
                 <w:sz w:val="18"/>
               </w:rPr>
               <w:t>MÉNĚ URGENTNÍ</w:t>
+            </w:r>
+          </w:p>
+        </w:tc>
+      </w:tr>
+      <w:tr>
+        <w:tc>
+          <w:tcPr>
+            <w:tcW w:type="dxa" w:w="2493"/>
+            <w:vAlign w:val="center"/>
+          </w:tcPr>
+          <w:p>
+            <w:pPr>
+              <w:jc w:val="center"/>
+            </w:pPr>
+            <w:r>
+              <w:rPr>
+                <w:sz w:val="18"/>
+              </w:rPr>
+              <w:t>35</w:t>
+            </w:r>
+          </w:p>
+        </w:tc>
+        <w:tc>
+          <w:tcPr>
+            <w:tcW w:type="dxa" w:w="2493"/>
+            <w:vAlign w:val="center"/>
+          </w:tcPr>
+          <w:p>
+            <w:r>
+              <w:rPr>
+                <w:sz w:val="18"/>
+              </w:rPr>
+              <w:t>Projektant (SMASH / TeAnau / TUSPO) nebo investor — viz akce</w:t>
+            </w:r>
+          </w:p>
+        </w:tc>
+        <w:tc>
+          <w:tcPr>
+            <w:tcW w:type="dxa" w:w="2493"/>
+            <w:vAlign w:val="center"/>
+          </w:tcPr>
+          <w:p>
+            <w:r>
+              <w:rPr>
+                <w:sz w:val="18"/>
+              </w:rPr>
+              <w:t>Sokl — rozpor PD: TZ ARS (XPS + cihelný) vs výkres S03/pohledy (sanační Styrcon + keramický)</w:t>
+            </w:r>
+          </w:p>
+        </w:tc>
+        <w:tc>
+          <w:tcPr>
+            <w:tcW w:type="dxa" w:w="2493"/>
+            <w:shd w:fill="FFF9C4"/>
+            <w:vAlign w:val="center"/>
+          </w:tcPr>
+          <w:p>
+            <w:r>
+              <w:rPr>
+                <w:sz w:val="18"/>
+              </w:rPr>
+              <w:t>STŘEDNĚ DŮLEŽITÉ</w:t>
             </w:r>
           </w:p>
         </w:tc>
@@ -6172,6 +6234,132 @@
     </w:p>
     <w:p/>
     <w:p>
+      <w:pPr>
+        <w:pStyle w:val="Heading2"/>
+      </w:pPr>
+      <w:r>
+        <w:t>Otázka č. 35:  Sokl — rozpor PD: TZ ARS (XPS + cihelný) vs výkres S03/pohledy (sanační Styrcon + keramický)</w:t>
+      </w:r>
+    </w:p>
+    <w:tbl>
+      <w:tblPr>
+        <w:tblStyle w:val="LightList-Accent1"/>
+        <w:tblW w:type="auto" w:w="0"/>
+        <w:tblLook w:firstColumn="1" w:firstRow="1" w:lastColumn="0" w:lastRow="0" w:noHBand="0" w:noVBand="1" w:val="04A0"/>
+      </w:tblPr>
+      <w:tblGrid>
+        <w:gridCol w:w="4986"/>
+        <w:gridCol w:w="4986"/>
+      </w:tblGrid>
+      <w:tr>
+        <w:tc>
+          <w:tcPr>
+            <w:tcW w:type="dxa" w:w="4986"/>
+          </w:tcPr>
+          <w:p>
+            <w:r>
+              <w:rPr>
+                <w:b/>
+              </w:rPr>
+              <w:t>Komu</w:t>
+            </w:r>
+          </w:p>
+        </w:tc>
+        <w:tc>
+          <w:tcPr>
+            <w:tcW w:type="dxa" w:w="4986"/>
+          </w:tcPr>
+          <w:p>
+            <w:r>
+              <w:t>Projektant (SMASH / TeAnau / TUSPO) nebo investor — viz akce</w:t>
+            </w:r>
+          </w:p>
+        </w:tc>
+      </w:tr>
+      <w:tr>
+        <w:tc>
+          <w:tcPr>
+            <w:tcW w:type="dxa" w:w="4986"/>
+          </w:tcPr>
+          <w:p>
+            <w:r>
+              <w:rPr>
+                <w:b/>
+              </w:rPr>
+              <w:t>Důležitost</w:t>
+            </w:r>
+          </w:p>
+        </w:tc>
+        <w:tc>
+          <w:tcPr>
+            <w:tcW w:type="dxa" w:w="4986"/>
+            <w:shd w:fill="FFF9C4"/>
+          </w:tcPr>
+          <w:p>
+            <w:r>
+              <w:rPr>
+                <w:b/>
+              </w:rPr>
+              <w:t>STŘEDNĚ DŮLEŽITÉ</w:t>
+            </w:r>
+          </w:p>
+        </w:tc>
+      </w:tr>
+    </w:tbl>
+    <w:p>
+      <w:r>
+        <w:rPr>
+          <w:b/>
+        </w:rPr>
+        <w:t>O co jde:</w:t>
+      </w:r>
+    </w:p>
+    <w:p>
+      <w:r>
+        <w:t>TZ ARS dům (text): 'V soklové části XPS + obklad z cihelného obkladu'. Skladba S03 + Řez A-A (S03b -0.200/-0.975) + pohledy (materiál C) uvádějí sanační Styrcon 200 + keramický obklad. Je to JEDEN sokl. ROZHODNUTO investorem: platí VÝKRES (Styrcon sanační + keramický). HSV7.003 (TZ varianta XPS+cihelný) odstraněn — jinak dvojí obklad (cihelný 13.5 + keramický 23 = 36.5 m² na soklu ~23 m²). Plocha S03 soklu 23 m² je obvod×výška BEZ řadovka faktoru — má být ×0.7 (≈16 m²).</w:t>
+      </w:r>
+    </w:p>
+    <w:p>
+      <w:r>
+        <w:rPr>
+          <w:b/>
+        </w:rPr>
+        <w:t>Co je třeba:</w:t>
+      </w:r>
+    </w:p>
+    <w:p>
+      <w:r>
+        <w:t>Projektante: potvrďte sokl = sanační Styrcon 200 + keramický obklad (výkres), NE XPS + cihelný (TZ ARS text). + délka soklu (řadovka): plocha ≈16 nebo 23 m²?</w:t>
+      </w:r>
+    </w:p>
+    <w:p>
+      <w:r>
+        <w:rPr>
+          <w:b/>
+        </w:rPr>
+        <w:t>Co prozatím máme (předpoklad pro výpočet):</w:t>
+      </w:r>
+    </w:p>
+    <w:p>
+      <w:r>
+        <w:t>Aplikován výkres S03 (Styrcon 200 sanační + keramický obklad). HSV7.003 (XPS+cihelný) odstraněn. Omítka HSV7.006 snížena 290.2→276.7 (sokl není omítka).</w:t>
+      </w:r>
+    </w:p>
+    <w:p>
+      <w:r>
+        <w:rPr>
+          <w:b/>
+        </w:rPr>
+        <w:t>Vliv na rozpočet:</w:t>
+      </w:r>
+    </w:p>
+    <w:p>
+      <w:r>
+        <w:t>Dotčené práce: HSV7.007/008/009 sokl S03 (Styrcon+keramický); HSV6.018 demontáž obkladu</w:t>
+      </w:r>
+    </w:p>
+    <w:p/>
+    <w:p>
       <w:r>
         <w:br w:type="page"/>
       </w:r>

</xml_diff>

<commit_message>
feat(rd-jachymov): sklad S01/S03a přepočet + zásyp/plot/zábradlí položky
Geometrie upřesněna dle ručního obmeru + řezů (uživatel):
- S01 podlaha: 17.6 m² (místnost) + 6.0 (vynos za stěnu, řez B-B) = 23.6 m²
  · HSV1.005 podkladní drť 150mm 2.64→3.54 m³
  · PSV77.001 dlažba 17.6→23.6 m²
  · NEW HSV1.007 kladecí lože drť 40mm 0.94 m³ (vrstva dříve chyběla)
- S03a tvárnice: výška 14 řad×250 = 3.5 m (PLNÁ, od pasu; 2.68 je světlá)
  · HSV3.002 46.5→62.5 m² (3 strany 17.84 m × 3.5)
  · HSV3.003 výztuž 1398→1875 kg
- NEW položky (geometrie známa, materiál OVĚŘIT → queue #36-38):
  · HSV1.008 zásyp za prefa stěnou 23.5 m³ (#36)
  · PSV76.003 oplocení 3.8 bm (#37)
  · PSV76.004 zábradlí 18.5 bm (#38)

queue 31→34; docx==queue assertion OK; 0 duplicitních ID (238 položek)

https://claude.ai/code/session_01FskzLAZkXgJAwuN2cQQEdx
</commit_message>
<xml_diff>
--- a/test-data/RD_Jachymov_dum/outputs/Otazky_pro_Karla_a_projektanty_2026-05-29.docx
+++ b/test-data/RD_Jachymov_dum/outputs/Otazky_pro_Karla_a_projektanty_2026-05-29.docx
@@ -160,7 +160,7 @@
     </w:p>
     <w:p>
       <w:r>
-        <w:t>Tento dokument obsahuje 31 otázek, které je třeba vyřešit s projektanty před cenovou kalkulací konkrétními řemesly a před zahájením realizace.</w:t>
+        <w:t>Tento dokument obsahuje 34 otázek, které je třeba vyřešit s projektanty před cenovou kalkulací konkrétními řemesly a před zahájením realizace.</w:t>
         <w:br/>
         <w:br/>
         <w:t>Každá otázka má uvedeno: kdo má odpovědět, co je třeba zjistit, jaký předpoklad jsme prozatím použili pro výpočet, a jak odpověď ovlivní rozpočet.</w:t>
@@ -2290,6 +2290,192 @@
           </w:p>
         </w:tc>
       </w:tr>
+      <w:tr>
+        <w:tc>
+          <w:tcPr>
+            <w:tcW w:type="dxa" w:w="2493"/>
+            <w:vAlign w:val="center"/>
+          </w:tcPr>
+          <w:p>
+            <w:pPr>
+              <w:jc w:val="center"/>
+            </w:pPr>
+            <w:r>
+              <w:rPr>
+                <w:sz w:val="18"/>
+              </w:rPr>
+              <w:t>36</w:t>
+            </w:r>
+          </w:p>
+        </w:tc>
+        <w:tc>
+          <w:tcPr>
+            <w:tcW w:type="dxa" w:w="2493"/>
+            <w:vAlign w:val="center"/>
+          </w:tcPr>
+          <w:p>
+            <w:r>
+              <w:rPr>
+                <w:sz w:val="18"/>
+              </w:rPr>
+              <w:t>Projektant (SMASH / TeAnau / TUSPO) nebo investor — viz akce</w:t>
+            </w:r>
+          </w:p>
+        </w:tc>
+        <w:tc>
+          <w:tcPr>
+            <w:tcW w:type="dxa" w:w="2493"/>
+            <w:vAlign w:val="center"/>
+          </w:tcPr>
+          <w:p>
+            <w:r>
+              <w:rPr>
+                <w:sz w:val="18"/>
+              </w:rPr>
+              <w:t>Zásyp za prefa opěrnou stěnou S04 — materiál neuveden v legendě</w:t>
+            </w:r>
+          </w:p>
+        </w:tc>
+        <w:tc>
+          <w:tcPr>
+            <w:tcW w:type="dxa" w:w="2493"/>
+            <w:shd w:fill="FFF9C4"/>
+            <w:vAlign w:val="center"/>
+          </w:tcPr>
+          <w:p>
+            <w:r>
+              <w:rPr>
+                <w:sz w:val="18"/>
+              </w:rPr>
+              <w:t>STŘEDNĚ DŮLEŽITÉ</w:t>
+            </w:r>
+          </w:p>
+        </w:tc>
+      </w:tr>
+      <w:tr>
+        <w:tc>
+          <w:tcPr>
+            <w:tcW w:type="dxa" w:w="2493"/>
+            <w:vAlign w:val="center"/>
+          </w:tcPr>
+          <w:p>
+            <w:pPr>
+              <w:jc w:val="center"/>
+            </w:pPr>
+            <w:r>
+              <w:rPr>
+                <w:sz w:val="18"/>
+              </w:rPr>
+              <w:t>37</w:t>
+            </w:r>
+          </w:p>
+        </w:tc>
+        <w:tc>
+          <w:tcPr>
+            <w:tcW w:type="dxa" w:w="2493"/>
+            <w:vAlign w:val="center"/>
+          </w:tcPr>
+          <w:p>
+            <w:r>
+              <w:rPr>
+                <w:sz w:val="18"/>
+              </w:rPr>
+              <w:t>Projektant (SMASH / TeAnau / TUSPO) nebo investor — viz akce</w:t>
+            </w:r>
+          </w:p>
+        </w:tc>
+        <w:tc>
+          <w:tcPr>
+            <w:tcW w:type="dxa" w:w="2493"/>
+            <w:vAlign w:val="center"/>
+          </w:tcPr>
+          <w:p>
+            <w:r>
+              <w:rPr>
+                <w:sz w:val="18"/>
+              </w:rPr>
+              <w:t>Oplocení (plot) u vjezdu — materiál + délka</w:t>
+            </w:r>
+          </w:p>
+        </w:tc>
+        <w:tc>
+          <w:tcPr>
+            <w:tcW w:type="dxa" w:w="2493"/>
+            <w:shd w:fill="FFF9C4"/>
+            <w:vAlign w:val="center"/>
+          </w:tcPr>
+          <w:p>
+            <w:r>
+              <w:rPr>
+                <w:sz w:val="18"/>
+              </w:rPr>
+              <w:t>STŘEDNĚ DŮLEŽITÉ</w:t>
+            </w:r>
+          </w:p>
+        </w:tc>
+      </w:tr>
+      <w:tr>
+        <w:tc>
+          <w:tcPr>
+            <w:tcW w:type="dxa" w:w="2493"/>
+            <w:vAlign w:val="center"/>
+          </w:tcPr>
+          <w:p>
+            <w:pPr>
+              <w:jc w:val="center"/>
+            </w:pPr>
+            <w:r>
+              <w:rPr>
+                <w:sz w:val="18"/>
+              </w:rPr>
+              <w:t>38</w:t>
+            </w:r>
+          </w:p>
+        </w:tc>
+        <w:tc>
+          <w:tcPr>
+            <w:tcW w:type="dxa" w:w="2493"/>
+            <w:vAlign w:val="center"/>
+          </w:tcPr>
+          <w:p>
+            <w:r>
+              <w:rPr>
+                <w:sz w:val="18"/>
+              </w:rPr>
+              <w:t>Projektant (SMASH / TeAnau / TUSPO) nebo investor — viz akce</w:t>
+            </w:r>
+          </w:p>
+        </w:tc>
+        <w:tc>
+          <w:tcPr>
+            <w:tcW w:type="dxa" w:w="2493"/>
+            <w:vAlign w:val="center"/>
+          </w:tcPr>
+          <w:p>
+            <w:r>
+              <w:rPr>
+                <w:sz w:val="18"/>
+              </w:rPr>
+              <w:t>Zábradlí stání 1.0 m — materiál</w:t>
+            </w:r>
+          </w:p>
+        </w:tc>
+        <w:tc>
+          <w:tcPr>
+            <w:tcW w:type="dxa" w:w="2493"/>
+            <w:shd w:fill="FFF9C4"/>
+            <w:vAlign w:val="center"/>
+          </w:tcPr>
+          <w:p>
+            <w:r>
+              <w:rPr>
+                <w:sz w:val="18"/>
+              </w:rPr>
+              <w:t>STŘEDNĚ DŮLEŽITÉ</w:t>
+            </w:r>
+          </w:p>
+        </w:tc>
+      </w:tr>
     </w:tbl>
     <w:p>
       <w:r>
@@ -6356,6 +6542,384 @@
     <w:p>
       <w:r>
         <w:t>Dotčené práce: HSV7.007/008/009 sokl S03 (Styrcon+keramický); HSV6.018 demontáž obkladu</w:t>
+      </w:r>
+    </w:p>
+    <w:p/>
+    <w:p>
+      <w:pPr>
+        <w:pStyle w:val="Heading2"/>
+      </w:pPr>
+      <w:r>
+        <w:t>Otázka č. 36:  Zásyp za prefa opěrnou stěnou S04 — materiál neuveden v legendě</w:t>
+      </w:r>
+    </w:p>
+    <w:tbl>
+      <w:tblPr>
+        <w:tblStyle w:val="LightList-Accent1"/>
+        <w:tblW w:type="auto" w:w="0"/>
+        <w:tblLook w:firstColumn="1" w:firstRow="1" w:lastColumn="0" w:lastRow="0" w:noHBand="0" w:noVBand="1" w:val="04A0"/>
+      </w:tblPr>
+      <w:tblGrid>
+        <w:gridCol w:w="4986"/>
+        <w:gridCol w:w="4986"/>
+      </w:tblGrid>
+      <w:tr>
+        <w:tc>
+          <w:tcPr>
+            <w:tcW w:type="dxa" w:w="4986"/>
+          </w:tcPr>
+          <w:p>
+            <w:r>
+              <w:rPr>
+                <w:b/>
+              </w:rPr>
+              <w:t>Komu</w:t>
+            </w:r>
+          </w:p>
+        </w:tc>
+        <w:tc>
+          <w:tcPr>
+            <w:tcW w:type="dxa" w:w="4986"/>
+          </w:tcPr>
+          <w:p>
+            <w:r>
+              <w:t>Projektant (SMASH / TeAnau / TUSPO) nebo investor — viz akce</w:t>
+            </w:r>
+          </w:p>
+        </w:tc>
+      </w:tr>
+      <w:tr>
+        <w:tc>
+          <w:tcPr>
+            <w:tcW w:type="dxa" w:w="4986"/>
+          </w:tcPr>
+          <w:p>
+            <w:r>
+              <w:rPr>
+                <w:b/>
+              </w:rPr>
+              <w:t>Důležitost</w:t>
+            </w:r>
+          </w:p>
+        </w:tc>
+        <w:tc>
+          <w:tcPr>
+            <w:tcW w:type="dxa" w:w="4986"/>
+            <w:shd w:fill="FFF9C4"/>
+          </w:tcPr>
+          <w:p>
+            <w:r>
+              <w:rPr>
+                <w:b/>
+              </w:rPr>
+              <w:t>STŘEDNĚ DŮLEŽITÉ</w:t>
+            </w:r>
+          </w:p>
+        </w:tc>
+      </w:tr>
+    </w:tbl>
+    <w:p>
+      <w:r>
+        <w:rPr>
+          <w:b/>
+        </w:rPr>
+        <w:t>O co jde:</w:t>
+      </w:r>
+    </w:p>
+    <w:p>
+      <w:r>
+        <w:t>Řez A-A: za prefa stěnou S04 klín zásypu ~3.61 m² × 6.5 m = 23.5 m³. Legenda materiálů neuvádí, čím se zasypává (rostlá zemina / štěrkopísek / jiné).</w:t>
+      </w:r>
+    </w:p>
+    <w:p>
+      <w:r>
+        <w:rPr>
+          <w:b/>
+        </w:rPr>
+        <w:t>Co je třeba:</w:t>
+      </w:r>
+    </w:p>
+    <w:p>
+      <w:r>
+        <w:t>Projektante: čím se provádí zásyp za opěrnou stěnou S04? (zemina / štěrkopísek / drť)</w:t>
+      </w:r>
+    </w:p>
+    <w:p>
+      <w:r>
+        <w:rPr>
+          <w:b/>
+        </w:rPr>
+        <w:t>Co prozatím máme (předpoklad pro výpočet):</w:t>
+      </w:r>
+    </w:p>
+    <w:p>
+      <w:r>
+        <w:t>Položka zařazena s objemem 23.5 m³, materiál jako zemina (174101101) provizorně.</w:t>
+      </w:r>
+    </w:p>
+    <w:p>
+      <w:r>
+        <w:rPr>
+          <w:b/>
+        </w:rPr>
+        <w:t>Vliv na rozpočet:</w:t>
+      </w:r>
+    </w:p>
+    <w:p>
+      <w:r>
+        <w:t>Dotčené práce: 260217_sklad.HSV1.008</w:t>
+      </w:r>
+    </w:p>
+    <w:p/>
+    <w:p>
+      <w:pPr>
+        <w:pStyle w:val="Heading2"/>
+      </w:pPr>
+      <w:r>
+        <w:t>Otázka č. 37:  Oplocení (plot) u vjezdu — materiál + délka</w:t>
+      </w:r>
+    </w:p>
+    <w:tbl>
+      <w:tblPr>
+        <w:tblStyle w:val="LightList-Accent1"/>
+        <w:tblW w:type="auto" w:w="0"/>
+        <w:tblLook w:firstColumn="1" w:firstRow="1" w:lastColumn="0" w:lastRow="0" w:noHBand="0" w:noVBand="1" w:val="04A0"/>
+      </w:tblPr>
+      <w:tblGrid>
+        <w:gridCol w:w="4986"/>
+        <w:gridCol w:w="4986"/>
+      </w:tblGrid>
+      <w:tr>
+        <w:tc>
+          <w:tcPr>
+            <w:tcW w:type="dxa" w:w="4986"/>
+          </w:tcPr>
+          <w:p>
+            <w:r>
+              <w:rPr>
+                <w:b/>
+              </w:rPr>
+              <w:t>Komu</w:t>
+            </w:r>
+          </w:p>
+        </w:tc>
+        <w:tc>
+          <w:tcPr>
+            <w:tcW w:type="dxa" w:w="4986"/>
+          </w:tcPr>
+          <w:p>
+            <w:r>
+              <w:t>Projektant (SMASH / TeAnau / TUSPO) nebo investor — viz akce</w:t>
+            </w:r>
+          </w:p>
+        </w:tc>
+      </w:tr>
+      <w:tr>
+        <w:tc>
+          <w:tcPr>
+            <w:tcW w:type="dxa" w:w="4986"/>
+          </w:tcPr>
+          <w:p>
+            <w:r>
+              <w:rPr>
+                <w:b/>
+              </w:rPr>
+              <w:t>Důležitost</w:t>
+            </w:r>
+          </w:p>
+        </w:tc>
+        <w:tc>
+          <w:tcPr>
+            <w:tcW w:type="dxa" w:w="4986"/>
+            <w:shd w:fill="FFF9C4"/>
+          </w:tcPr>
+          <w:p>
+            <w:r>
+              <w:rPr>
+                <w:b/>
+              </w:rPr>
+              <w:t>STŘEDNĚ DŮLEŽITÉ</w:t>
+            </w:r>
+          </w:p>
+        </w:tc>
+      </w:tr>
+    </w:tbl>
+    <w:p>
+      <w:r>
+        <w:rPr>
+          <w:b/>
+        </w:rPr>
+        <w:t>O co jde:</w:t>
+      </w:r>
+    </w:p>
+    <w:p>
+      <w:r>
+        <w:t>D.1.1.01: plot u vjezdu. Délka odhad 7775−4000 (vrata) = 3.8 bm. Materiál (kov/dřevo/pletivo) ani výška v legendě neuvedeny. Sloupek u vrat v PD nerozkreslen.</w:t>
+      </w:r>
+    </w:p>
+    <w:p>
+      <w:r>
+        <w:rPr>
+          <w:b/>
+        </w:rPr>
+        <w:t>Co je třeba:</w:t>
+      </w:r>
+    </w:p>
+    <w:p>
+      <w:r>
+        <w:t>Projektante: materiál + výška + přesná délka oplocení u vjezdu? + specifikace sloupku u vrat?</w:t>
+      </w:r>
+    </w:p>
+    <w:p>
+      <w:r>
+        <w:rPr>
+          <w:b/>
+        </w:rPr>
+        <w:t>Co prozatím máme (předpoklad pro výpočet):</w:t>
+      </w:r>
+    </w:p>
+    <w:p>
+      <w:r>
+        <w:t>Položka zařazena 3.8 bm, materiál OVĚŘIT.</w:t>
+      </w:r>
+    </w:p>
+    <w:p>
+      <w:r>
+        <w:rPr>
+          <w:b/>
+        </w:rPr>
+        <w:t>Vliv na rozpočet:</w:t>
+      </w:r>
+    </w:p>
+    <w:p>
+      <w:r>
+        <w:t>Dotčené práce: 260217_sklad.PSV76.003</w:t>
+      </w:r>
+    </w:p>
+    <w:p/>
+    <w:p>
+      <w:pPr>
+        <w:pStyle w:val="Heading2"/>
+      </w:pPr>
+      <w:r>
+        <w:t>Otázka č. 38:  Zábradlí stání 1.0 m — materiál</w:t>
+      </w:r>
+    </w:p>
+    <w:tbl>
+      <w:tblPr>
+        <w:tblStyle w:val="LightList-Accent1"/>
+        <w:tblW w:type="auto" w:w="0"/>
+        <w:tblLook w:firstColumn="1" w:firstRow="1" w:lastColumn="0" w:lastRow="0" w:noHBand="0" w:noVBand="1" w:val="04A0"/>
+      </w:tblPr>
+      <w:tblGrid>
+        <w:gridCol w:w="4986"/>
+        <w:gridCol w:w="4986"/>
+      </w:tblGrid>
+      <w:tr>
+        <w:tc>
+          <w:tcPr>
+            <w:tcW w:type="dxa" w:w="4986"/>
+          </w:tcPr>
+          <w:p>
+            <w:r>
+              <w:rPr>
+                <w:b/>
+              </w:rPr>
+              <w:t>Komu</w:t>
+            </w:r>
+          </w:p>
+        </w:tc>
+        <w:tc>
+          <w:tcPr>
+            <w:tcW w:type="dxa" w:w="4986"/>
+          </w:tcPr>
+          <w:p>
+            <w:r>
+              <w:t>Projektant (SMASH / TeAnau / TUSPO) nebo investor — viz akce</w:t>
+            </w:r>
+          </w:p>
+        </w:tc>
+      </w:tr>
+      <w:tr>
+        <w:tc>
+          <w:tcPr>
+            <w:tcW w:type="dxa" w:w="4986"/>
+          </w:tcPr>
+          <w:p>
+            <w:r>
+              <w:rPr>
+                <w:b/>
+              </w:rPr>
+              <w:t>Důležitost</w:t>
+            </w:r>
+          </w:p>
+        </w:tc>
+        <w:tc>
+          <w:tcPr>
+            <w:tcW w:type="dxa" w:w="4986"/>
+            <w:shd w:fill="FFF9C4"/>
+          </w:tcPr>
+          <w:p>
+            <w:r>
+              <w:rPr>
+                <w:b/>
+              </w:rPr>
+              <w:t>STŘEDNĚ DŮLEŽITÉ</w:t>
+            </w:r>
+          </w:p>
+        </w:tc>
+      </w:tr>
+    </w:tbl>
+    <w:p>
+      <w:r>
+        <w:rPr>
+          <w:b/>
+        </w:rPr>
+        <w:t>O co jde:</w:t>
+      </w:r>
+    </w:p>
+    <w:p>
+      <w:r>
+        <w:t>D.1.1.01: zábradlí v. 1.0 m kolem části stání ~18.5 bm. Materiál (ocel/dřevo) neuveden.</w:t>
+      </w:r>
+    </w:p>
+    <w:p>
+      <w:r>
+        <w:rPr>
+          <w:b/>
+        </w:rPr>
+        <w:t>Co je třeba:</w:t>
+      </w:r>
+    </w:p>
+    <w:p>
+      <w:r>
+        <w:t>Projektante: materiál + provedení zábradlí stání (1.0 m)?</w:t>
+      </w:r>
+    </w:p>
+    <w:p>
+      <w:r>
+        <w:rPr>
+          <w:b/>
+        </w:rPr>
+        <w:t>Co prozatím máme (předpoklad pro výpočet):</w:t>
+      </w:r>
+    </w:p>
+    <w:p>
+      <w:r>
+        <w:t>Položka zařazena 18.5 bm, materiál OVĚŘIT.</w:t>
+      </w:r>
+    </w:p>
+    <w:p>
+      <w:r>
+        <w:rPr>
+          <w:b/>
+        </w:rPr>
+        <w:t>Vliv na rozpočet:</w:t>
+      </w:r>
+    </w:p>
+    <w:p>
+      <w:r>
+        <w:t>Dotčené práce: 260217_sklad.PSV76.004</w:t>
       </w:r>
     </w:p>
     <w:p/>

</xml_diff>

<commit_message>
feat(rd-jachymov): sklad základy — bednění + výztuž patek/pasů + věnec 6.7
Uživatel: ztracené bednění z tvárnic = duté bloky zalité betonem + výztuž
uvnitř; chyběla opalubka + výztuž patek a pasů.
- HSV2.007 NEW bednění základů (patky spodní 6 m² + pasy 19.4 m²) = 25.4 m²
- HSV2.008 NEW výztuž B500B do tvárnic ZB (patky horní + věnec) = 153 kg
  (zálivka 1.275 m³ × 120 kg/m³ = stěna 30 kg/m² ÷ 0.25)
- HSV2.004 věnec délka 6.35→6.7 m (ruční obmer), zálivka → 1.77 m³
- queue #42: bednění do rýhy vs systémové + prostý beton pasů (výztuž?) OVĚŘIT

https://claude.ai/code/session_01FskzLAZkXgJAwuN2cQQEdx
</commit_message>
<xml_diff>
--- a/test-data/RD_Jachymov_dum/outputs/Otazky_pro_Karla_a_projektanty_2026-05-29.docx
+++ b/test-data/RD_Jachymov_dum/outputs/Otazky_pro_Karla_a_projektanty_2026-05-29.docx
@@ -160,7 +160,7 @@
     </w:p>
     <w:p>
       <w:r>
-        <w:t>Tento dokument obsahuje 37 otázek, které je třeba vyřešit s projektanty před cenovou kalkulací konkrétními řemesly a před zahájením realizace.</w:t>
+        <w:t>Tento dokument obsahuje 38 otázek, které je třeba vyřešit s projektanty před cenovou kalkulací konkrétními řemesly a před zahájením realizace.</w:t>
         <w:br/>
         <w:br/>
         <w:t>Každá otázka má uvedeno: kdo má odpovědět, co je třeba zjistit, jaký předpoklad jsme prozatím použili pro výpočet, a jak odpověď ovlivní rozpočet.</w:t>
@@ -2643,6 +2643,68 @@
                 <w:sz w:val="18"/>
               </w:rPr>
               <w:t>Schodiště S05 — komplet prefa s podestou vs rozložit na vrstvy</w:t>
+            </w:r>
+          </w:p>
+        </w:tc>
+        <w:tc>
+          <w:tcPr>
+            <w:tcW w:type="dxa" w:w="2493"/>
+            <w:shd w:fill="FFF9C4"/>
+            <w:vAlign w:val="center"/>
+          </w:tcPr>
+          <w:p>
+            <w:r>
+              <w:rPr>
+                <w:sz w:val="18"/>
+              </w:rPr>
+              <w:t>STŘEDNĚ DŮLEŽITÉ</w:t>
+            </w:r>
+          </w:p>
+        </w:tc>
+      </w:tr>
+      <w:tr>
+        <w:tc>
+          <w:tcPr>
+            <w:tcW w:type="dxa" w:w="2493"/>
+            <w:vAlign w:val="center"/>
+          </w:tcPr>
+          <w:p>
+            <w:pPr>
+              <w:jc w:val="center"/>
+            </w:pPr>
+            <w:r>
+              <w:rPr>
+                <w:sz w:val="18"/>
+              </w:rPr>
+              <w:t>42</w:t>
+            </w:r>
+          </w:p>
+        </w:tc>
+        <w:tc>
+          <w:tcPr>
+            <w:tcW w:type="dxa" w:w="2493"/>
+            <w:vAlign w:val="center"/>
+          </w:tcPr>
+          <w:p>
+            <w:r>
+              <w:rPr>
+                <w:sz w:val="18"/>
+              </w:rPr>
+              <w:t>Projektant (SMASH / TeAnau / TUSPO) nebo investor — viz akce</w:t>
+            </w:r>
+          </w:p>
+        </w:tc>
+        <w:tc>
+          <w:tcPr>
+            <w:tcW w:type="dxa" w:w="2493"/>
+            <w:vAlign w:val="center"/>
+          </w:tcPr>
+          <w:p>
+            <w:r>
+              <w:rPr>
+                <w:sz w:val="18"/>
+              </w:rPr>
+              <w:t>Základy sklad — bednění (do rýhy vs systémové) + výztuž pasů/patek spodních</w:t>
             </w:r>
           </w:p>
         </w:tc>
@@ -7484,6 +7546,132 @@
     <w:p>
       <w:r>
         <w:t>Dotčené práce: 260217_sklad.HSV5.001; 260217_sklad.HSV5.008; 260217_sklad.HSV5.009</w:t>
+      </w:r>
+    </w:p>
+    <w:p/>
+    <w:p>
+      <w:pPr>
+        <w:pStyle w:val="Heading2"/>
+      </w:pPr>
+      <w:r>
+        <w:t>Otázka č. 42:  Základy sklad — bednění (do rýhy vs systémové) + výztuž pasů/patek spodních</w:t>
+      </w:r>
+    </w:p>
+    <w:tbl>
+      <w:tblPr>
+        <w:tblStyle w:val="LightList-Accent1"/>
+        <w:tblW w:type="auto" w:w="0"/>
+        <w:tblLook w:firstColumn="1" w:firstRow="1" w:lastColumn="0" w:lastRow="0" w:noHBand="0" w:noVBand="1" w:val="04A0"/>
+      </w:tblPr>
+      <w:tblGrid>
+        <w:gridCol w:w="4986"/>
+        <w:gridCol w:w="4986"/>
+      </w:tblGrid>
+      <w:tr>
+        <w:tc>
+          <w:tcPr>
+            <w:tcW w:type="dxa" w:w="4986"/>
+          </w:tcPr>
+          <w:p>
+            <w:r>
+              <w:rPr>
+                <w:b/>
+              </w:rPr>
+              <w:t>Komu</w:t>
+            </w:r>
+          </w:p>
+        </w:tc>
+        <w:tc>
+          <w:tcPr>
+            <w:tcW w:type="dxa" w:w="4986"/>
+          </w:tcPr>
+          <w:p>
+            <w:r>
+              <w:t>Projektant (SMASH / TeAnau / TUSPO) nebo investor — viz akce</w:t>
+            </w:r>
+          </w:p>
+        </w:tc>
+      </w:tr>
+      <w:tr>
+        <w:tc>
+          <w:tcPr>
+            <w:tcW w:type="dxa" w:w="4986"/>
+          </w:tcPr>
+          <w:p>
+            <w:r>
+              <w:rPr>
+                <w:b/>
+              </w:rPr>
+              <w:t>Důležitost</w:t>
+            </w:r>
+          </w:p>
+        </w:tc>
+        <w:tc>
+          <w:tcPr>
+            <w:tcW w:type="dxa" w:w="4986"/>
+            <w:shd w:fill="FFF9C4"/>
+          </w:tcPr>
+          <w:p>
+            <w:r>
+              <w:rPr>
+                <w:b/>
+              </w:rPr>
+              <w:t>STŘEDNĚ DŮLEŽITÉ</w:t>
+            </w:r>
+          </w:p>
+        </w:tc>
+      </w:tr>
+    </w:tbl>
+    <w:p>
+      <w:r>
+        <w:rPr>
+          <w:b/>
+        </w:rPr>
+        <w:t>O co jde:</w:t>
+      </w:r>
+    </w:p>
+    <w:p>
+      <w:r>
+        <w:t>Pasy (HSV2.001) + patky spodní (HSV2.002) = prostý beton C16/20 (dle TZ bez výztuže). Bednění (HSV2.007) odhadnuto na plné systémové — část lze betonovat přímo do rýhy/figury (bez bednění). Výztuž (HSV2.008) započtena POUZE do tvárnic ZB (patky horní + věnec); prostý beton pasů/patek spodních bez výztuže dle TZ.</w:t>
+      </w:r>
+    </w:p>
+    <w:p>
+      <w:r>
+        <w:rPr>
+          <w:b/>
+        </w:rPr>
+        <w:t>Co je třeba:</w:t>
+      </w:r>
+    </w:p>
+    <w:p>
+      <w:r>
+        <w:t>Projektante: 1) podíl bednění do rýhy vs systémové u pasů? 2) jsou pasy/patky spodní opravdu prostý beton bez výztuže (dle TZ), nebo vyztužené?</w:t>
+      </w:r>
+    </w:p>
+    <w:p>
+      <w:r>
+        <w:rPr>
+          <w:b/>
+        </w:rPr>
+        <w:t>Co prozatím máme (předpoklad pro výpočet):</w:t>
+      </w:r>
+    </w:p>
+    <w:p>
+      <w:r>
+        <w:t>Bednění plné systémové 25.4 m²; výztuž jen tvárnice ZB 153 kg; pasy/patky spodní prostý beton bez výztuže.</w:t>
+      </w:r>
+    </w:p>
+    <w:p>
+      <w:r>
+        <w:rPr>
+          <w:b/>
+        </w:rPr>
+        <w:t>Vliv na rozpočet:</w:t>
+      </w:r>
+    </w:p>
+    <w:p>
+      <w:r>
+        <w:t>Dotčené práce: 260217_sklad.HSV2.007; 260217_sklad.HSV2.008; 260217_sklad.HSV2.001; 260217_sklad.HSV2.002</w:t>
       </w:r>
     </w:p>
     <w:p/>

</xml_diff>